<commit_message>
feat: add catch22 matrix, standardization and exploratory analysis (2.3-2.5)
</commit_message>
<xml_diff>
--- a/Informe Lab02.docx
+++ b/Informe Lab02.docx
@@ -7,8 +7,16 @@
         <w:spacing w:after="396" w:line="259" w:lineRule="auto"/>
         <w:ind w:left="56" w:right="0" w:firstLine="0"/>
         <w:jc w:val="center"/>
-      </w:pPr>
-      <w:r>
+        <w:rPr>
+          <w:sz w:val="28"/>
+          <w:szCs w:val="28"/>
+        </w:rPr>
+      </w:pPr>
+      <w:r>
+        <w:rPr>
+          <w:sz w:val="28"/>
+          <w:szCs w:val="28"/>
+        </w:rPr>
         <w:t xml:space="preserve"> </w:t>
       </w:r>
     </w:p>
@@ -17,32 +25,54 @@
         <w:spacing w:after="19" w:line="259" w:lineRule="auto"/>
         <w:ind w:left="2498" w:right="0" w:firstLine="0"/>
         <w:jc w:val="left"/>
+        <w:rPr>
+          <w:sz w:val="32"/>
+          <w:szCs w:val="32"/>
+        </w:rPr>
       </w:pPr>
       <w:r>
         <w:rPr>
           <w:b/>
-          <w:sz w:val="30"/>
+          <w:sz w:val="32"/>
+          <w:szCs w:val="32"/>
         </w:rPr>
         <w:t>Universidad del Valle de Guatemala</w:t>
       </w:r>
       <w:r>
+        <w:rPr>
+          <w:sz w:val="32"/>
+          <w:szCs w:val="32"/>
+        </w:rPr>
         <w:t xml:space="preserve"> </w:t>
       </w:r>
+    </w:p>
+    <w:p>
+      <w:pPr>
+        <w:spacing w:after="19" w:line="259" w:lineRule="auto"/>
+        <w:ind w:left="2498" w:right="0" w:firstLine="0"/>
+        <w:jc w:val="left"/>
+        <w:rPr>
+          <w:sz w:val="32"/>
+          <w:szCs w:val="32"/>
+        </w:rPr>
+      </w:pPr>
     </w:p>
     <w:p>
       <w:pPr>
         <w:spacing w:after="58" w:line="259" w:lineRule="auto"/>
         <w:ind w:left="0" w:right="5" w:firstLine="0"/>
         <w:jc w:val="center"/>
-      </w:pPr>
-      <w:r>
-        <w:rPr>
-          <w:sz w:val="26"/>
-        </w:rPr>
-        <w:t>Facultad de Ingeniería</w:t>
-      </w:r>
-      <w:r>
-        <w:t xml:space="preserve"> </w:t>
+        <w:rPr>
+          <w:sz w:val="28"/>
+          <w:szCs w:val="28"/>
+        </w:rPr>
+      </w:pPr>
+      <w:r>
+        <w:rPr>
+          <w:sz w:val="28"/>
+          <w:szCs w:val="28"/>
+        </w:rPr>
+        <w:t xml:space="preserve">Facultad de Ingeniería </w:t>
       </w:r>
     </w:p>
     <w:p>
@@ -50,15 +80,17 @@
         <w:spacing w:after="50" w:line="259" w:lineRule="auto"/>
         <w:ind w:left="2429" w:right="0" w:firstLine="0"/>
         <w:jc w:val="left"/>
-      </w:pPr>
-      <w:r>
-        <w:rPr>
-          <w:sz w:val="26"/>
-        </w:rPr>
-        <w:t>Departamento de Ciencias de la Computación</w:t>
-      </w:r>
-      <w:r>
-        <w:t xml:space="preserve"> </w:t>
+        <w:rPr>
+          <w:sz w:val="28"/>
+          <w:szCs w:val="28"/>
+        </w:rPr>
+      </w:pPr>
+      <w:r>
+        <w:rPr>
+          <w:sz w:val="28"/>
+          <w:szCs w:val="28"/>
+        </w:rPr>
+        <w:t xml:space="preserve">Departamento de Ciencias de la Computación </w:t>
       </w:r>
     </w:p>
     <w:p>
@@ -67,12 +99,15 @@
         <w:ind w:left="2794" w:right="0" w:firstLine="0"/>
         <w:jc w:val="left"/>
         <w:rPr>
+          <w:sz w:val="28"/>
+          <w:szCs w:val="28"/>
           <w:lang w:val="en-US"/>
         </w:rPr>
       </w:pPr>
       <w:r>
         <w:rPr>
-          <w:sz w:val="25"/>
+          <w:sz w:val="28"/>
+          <w:szCs w:val="28"/>
           <w:lang w:val="en-US"/>
         </w:rPr>
         <w:t xml:space="preserve">CC3084 Data Science, </w:t>
@@ -80,7 +115,8 @@
       <w:proofErr w:type="spellStart"/>
       <w:r>
         <w:rPr>
-          <w:sz w:val="25"/>
+          <w:sz w:val="28"/>
+          <w:szCs w:val="28"/>
           <w:lang w:val="en-US"/>
         </w:rPr>
         <w:t>Semestre</w:t>
@@ -88,17 +124,24 @@
       <w:proofErr w:type="spellEnd"/>
       <w:r>
         <w:rPr>
-          <w:sz w:val="25"/>
+          <w:sz w:val="28"/>
+          <w:szCs w:val="28"/>
           <w:lang w:val="en-US"/>
         </w:rPr>
-        <w:t xml:space="preserve"> II 2026</w:t>
-      </w:r>
-      <w:r>
-        <w:rPr>
+        <w:t xml:space="preserve"> II 2026 </w:t>
+      </w:r>
+    </w:p>
+    <w:p>
+      <w:pPr>
+        <w:spacing w:after="729" w:line="259" w:lineRule="auto"/>
+        <w:ind w:left="2794" w:right="0" w:firstLine="0"/>
+        <w:jc w:val="left"/>
+        <w:rPr>
+          <w:sz w:val="28"/>
+          <w:szCs w:val="28"/>
           <w:lang w:val="en-US"/>
         </w:rPr>
-        <w:t xml:space="preserve"> </w:t>
-      </w:r>
+      </w:pPr>
     </w:p>
     <w:p>
       <w:pPr>
@@ -192,27 +235,63 @@
         <w:spacing w:after="2" w:line="307" w:lineRule="auto"/>
         <w:ind w:left="3364" w:right="3306" w:firstLine="0"/>
         <w:jc w:val="center"/>
-      </w:pPr>
-      <w:r>
         <w:rPr>
           <w:b/>
           <w:sz w:val="25"/>
         </w:rPr>
-        <w:t>Integrantes del grupo</w:t>
-      </w:r>
-      <w:r>
-        <w:t xml:space="preserve"> </w:t>
-      </w:r>
+      </w:pPr>
     </w:p>
     <w:p>
       <w:pPr>
         <w:spacing w:after="2" w:line="307" w:lineRule="auto"/>
         <w:ind w:left="3364" w:right="3306" w:firstLine="0"/>
         <w:jc w:val="center"/>
-      </w:pPr>
-      <w:r>
-        <w:rPr>
+        <w:rPr>
+          <w:b/>
           <w:sz w:val="25"/>
+        </w:rPr>
+      </w:pPr>
+    </w:p>
+    <w:p>
+      <w:pPr>
+        <w:spacing w:after="2" w:line="307" w:lineRule="auto"/>
+        <w:ind w:left="3364" w:right="3306" w:firstLine="0"/>
+        <w:jc w:val="center"/>
+        <w:rPr>
+          <w:sz w:val="28"/>
+          <w:szCs w:val="28"/>
+        </w:rPr>
+      </w:pPr>
+      <w:r>
+        <w:rPr>
+          <w:b/>
+          <w:sz w:val="28"/>
+          <w:szCs w:val="28"/>
+        </w:rPr>
+        <w:t>Integrantes del grupo</w:t>
+      </w:r>
+      <w:r>
+        <w:rPr>
+          <w:sz w:val="28"/>
+          <w:szCs w:val="28"/>
+        </w:rPr>
+        <w:t xml:space="preserve"> </w:t>
+      </w:r>
+    </w:p>
+    <w:p>
+      <w:pPr>
+        <w:spacing w:after="2" w:line="307" w:lineRule="auto"/>
+        <w:ind w:left="3364" w:right="3306" w:firstLine="0"/>
+        <w:jc w:val="center"/>
+        <w:rPr>
+          <w:sz w:val="28"/>
+          <w:szCs w:val="28"/>
+        </w:rPr>
+      </w:pPr>
+      <w:r>
+        <w:rPr>
+          <w:sz w:val="28"/>
+          <w:szCs w:val="28"/>
         </w:rPr>
         <w:t xml:space="preserve">Javier España #23361 </w:t>
       </w:r>
@@ -222,10 +301,15 @@
         <w:spacing w:after="51" w:line="265" w:lineRule="auto"/>
         <w:ind w:right="1"/>
         <w:jc w:val="center"/>
-      </w:pPr>
-      <w:r>
-        <w:rPr>
-          <w:sz w:val="25"/>
+        <w:rPr>
+          <w:sz w:val="28"/>
+          <w:szCs w:val="28"/>
+        </w:rPr>
+      </w:pPr>
+      <w:r>
+        <w:rPr>
+          <w:sz w:val="28"/>
+          <w:szCs w:val="28"/>
         </w:rPr>
         <w:t xml:space="preserve">Ángel Esquit #23221 </w:t>
       </w:r>
@@ -235,15 +319,17 @@
         <w:spacing w:after="541" w:line="265" w:lineRule="auto"/>
         <w:ind w:right="4"/>
         <w:jc w:val="center"/>
-      </w:pPr>
-      <w:r>
-        <w:rPr>
-          <w:sz w:val="25"/>
-        </w:rPr>
-        <w:t>Roberto Barreda #23354</w:t>
-      </w:r>
-      <w:r>
-        <w:t xml:space="preserve"> </w:t>
+        <w:rPr>
+          <w:sz w:val="28"/>
+          <w:szCs w:val="28"/>
+        </w:rPr>
+      </w:pPr>
+      <w:r>
+        <w:rPr>
+          <w:sz w:val="28"/>
+          <w:szCs w:val="28"/>
+        </w:rPr>
+        <w:t xml:space="preserve">Roberto Barreda #23354 </w:t>
       </w:r>
     </w:p>
     <w:p>
@@ -251,35 +337,45 @@
         <w:spacing w:after="99" w:line="258" w:lineRule="auto"/>
         <w:ind w:left="40" w:right="32"/>
         <w:jc w:val="center"/>
-      </w:pPr>
-      <w:r>
+        <w:rPr>
+          <w:sz w:val="28"/>
+          <w:szCs w:val="28"/>
+        </w:rPr>
+      </w:pPr>
+      <w:r>
+        <w:rPr>
+          <w:sz w:val="28"/>
+          <w:szCs w:val="28"/>
+        </w:rPr>
         <w:t xml:space="preserve">Guatemala, </w:t>
       </w:r>
       <w:r>
+        <w:rPr>
+          <w:sz w:val="28"/>
+          <w:szCs w:val="28"/>
+        </w:rPr>
         <w:t>2</w:t>
       </w:r>
       <w:r>
+        <w:rPr>
+          <w:sz w:val="28"/>
+          <w:szCs w:val="28"/>
+        </w:rPr>
         <w:t xml:space="preserve"> de </w:t>
       </w:r>
       <w:r>
+        <w:rPr>
+          <w:sz w:val="28"/>
+          <w:szCs w:val="28"/>
+        </w:rPr>
         <w:t>agosto</w:t>
       </w:r>
       <w:r>
+        <w:rPr>
+          <w:sz w:val="28"/>
+          <w:szCs w:val="28"/>
+        </w:rPr>
         <w:t xml:space="preserve"> de 2026 </w:t>
-      </w:r>
-    </w:p>
-    <w:p>
-      <w:r>
-        <w:br w:type="page"/>
-      </w:r>
-    </w:p>
-    <w:p>
-      <w:pPr>
-        <w:pStyle w:val="Heading1"/>
-      </w:pPr>
-      <w:r>
-        <w:lastRenderedPageBreak/>
-        <w:t>Ejercicio 2. Análisis de similitud con catch22</w:t>
       </w:r>
     </w:p>
     <w:p>
@@ -290,6 +386,27 @@
           <w:numId w:val="0"/>
         </w:numPr>
         <w:ind w:left="10"/>
+        <w:jc w:val="center"/>
+      </w:pPr>
+      <w:r>
+        <w:lastRenderedPageBreak/>
+        <w:t>Ejercicio 2</w:t>
+      </w:r>
+      <w:r>
+        <w:t xml:space="preserve">: </w:t>
+      </w:r>
+      <w:r>
+        <w:t>Análisis de similitud con catch22</w:t>
+      </w:r>
+    </w:p>
+    <w:p>
+      <w:pPr>
+        <w:pStyle w:val="Heading1"/>
+        <w:numPr>
+          <w:ilvl w:val="0"/>
+          <w:numId w:val="0"/>
+        </w:numPr>
+        <w:ind w:left="10"/>
         <w:rPr>
           <w:sz w:val="24"/>
           <w:szCs w:val="22"/>
@@ -314,6 +431,7 @@
         <w:t xml:space="preserve"> en un vector interpretable de tamaño fijo, lo que permite compararla mediante PCA, clustering o distancias con un costo aproximadamente lineal. catch22 se calcula sobre la serie normalizada, por lo que el nivel medio y la varianza absoluta quedan fuera de las 22 características, ya que se compara la forma del comportamiento y no la magnitud.</w:t>
       </w:r>
     </w:p>
+    <w:p/>
     <w:p>
       <w:pPr>
         <w:pStyle w:val="Heading2"/>
@@ -340,7 +458,11 @@
         <w:t>Se extrajeron las 22 características de catch22 para las siete series construidas en el Laboratorio 1, usando la serie completa de cada una (enero 2009 a junio 2026, 210 observaciones mensuales) y no solo el conjunto de entrenamiento, ya que el objetivo es caracterizar el comportamiento de cada serie, listadas en la Tabla 1.</w:t>
       </w:r>
     </w:p>
-    <w:p>
+    <w:p/>
+    <w:p>
+      <w:pPr>
+        <w:jc w:val="center"/>
+      </w:pPr>
       <w:r>
         <w:rPr>
           <w:b/>
@@ -553,12 +675,20 @@
         </w:tc>
       </w:tr>
     </w:tbl>
-    <w:p>
-      <w:r>
-        <w:t>Cada serie se normalizó a media cero y desviación uno, tras replicar el preprocesamiento del Laboratorio 1, condición que exige la definición original de catch22. La extracción se implementó en src/ExtraccionCatch22.py con la librería aeon, en lugar de pycatch22, que no compila en el entorno de trabajo (Python 3.14 sin Microsoft Visual C++ Build Tools). El resultado es una matriz de 7 filas por 22 columnas guardada en results/Catch22Features.csv, que se muestra en la Tabla 2.</w:t>
-      </w:r>
-    </w:p>
-    <w:p>
+    <w:p/>
+    <w:p>
+      <w:r>
+        <w:t xml:space="preserve">Cada serie se normalizó a media cero y desviación uno, tras replicar el preprocesamiento del Laboratorio 1, condición que exige la definición original de catch22. La extracción se implementó en src/ExtraccionCatch22.py con la librería aeon, en lugar de pycatch22, que no compila en el entorno de trabajo (Python 3.14 sin Microsoft Visual C++ Build Tools). El resultado es una matriz de 7 filas </w:t>
+      </w:r>
+      <w:r>
+        <w:t>por 22 columnas guardada en results/Catch22Features.csv, que se muestra en la Tabla 2.</w:t>
+      </w:r>
+    </w:p>
+    <w:p/>
+    <w:p>
+      <w:pPr>
+        <w:jc w:val="center"/>
+      </w:pPr>
       <w:r>
         <w:rPr>
           <w:b/>
@@ -597,6 +727,7 @@
               <w:rPr>
                 <w:b/>
               </w:rPr>
+              <w:lastRenderedPageBreak/>
               <w:t>Característica</w:t>
             </w:r>
           </w:p>
@@ -667,7 +798,6 @@
           </w:tcPr>
           <w:p>
             <w:r>
-              <w:lastRenderedPageBreak/>
               <w:t>CO_f1ecac</w:t>
             </w:r>
           </w:p>
@@ -1044,6 +1174,7 @@
               <w:rPr>
                 <w:lang w:val="en-US"/>
               </w:rPr>
+              <w:lastRenderedPageBreak/>
               <w:t>SC_FluctAnal_2_rsrangefit_50_1_logi_prop_r1</w:t>
             </w:r>
           </w:p>
@@ -1096,7 +1227,6 @@
               <w:rPr>
                 <w:lang w:val="en-US"/>
               </w:rPr>
-              <w:lastRenderedPageBreak/>
               <w:t>SP_Summaries_welch_rect_centroid</w:t>
             </w:r>
           </w:p>
@@ -1138,6 +1268,801 @@
     <w:p/>
     <w:p>
       <w:pPr>
+        <w:pStyle w:val="Heading2"/>
+        <w:numPr>
+          <w:ilvl w:val="0"/>
+          <w:numId w:val="0"/>
+        </w:numPr>
+        <w:ind w:left="10"/>
+        <w:rPr>
+          <w:sz w:val="24"/>
+          <w:szCs w:val="22"/>
+        </w:rPr>
+      </w:pPr>
+      <w:r>
+        <w:rPr>
+          <w:sz w:val="24"/>
+          <w:szCs w:val="22"/>
+        </w:rPr>
+        <w:t>2.3 Matriz de características</w:t>
+      </w:r>
+    </w:p>
+    <w:p>
+      <w:r>
+        <w:t xml:space="preserve">La matriz de características tiene 7 filas (una por serie) y 22 columnas (una por característica de catch22), sin valores faltantes, guardada en </w:t>
+      </w:r>
+      <w:proofErr w:type="spellStart"/>
+      <w:r>
+        <w:t>results</w:t>
+      </w:r>
+      <w:proofErr w:type="spellEnd"/>
+      <w:r>
+        <w:t>/Catch22Features.csv.</w:t>
+      </w:r>
+    </w:p>
+    <w:p/>
+    <w:p>
+      <w:pPr>
+        <w:pStyle w:val="Heading2"/>
+        <w:numPr>
+          <w:ilvl w:val="0"/>
+          <w:numId w:val="0"/>
+        </w:numPr>
+        <w:rPr>
+          <w:sz w:val="24"/>
+          <w:szCs w:val="22"/>
+        </w:rPr>
+      </w:pPr>
+      <w:r>
+        <w:rPr>
+          <w:sz w:val="24"/>
+          <w:szCs w:val="22"/>
+        </w:rPr>
+        <w:t>2.4 Estandarización</w:t>
+      </w:r>
+    </w:p>
+    <w:p>
+      <w:r>
+        <w:t>Cada columna se llevó a media cero y desviación uno con StandardScaler, ya que las 22 características no comparten unidad ni rango: sin estandarizar, SB_BinaryStats_mean_longstretch1 llega a 51 y PD_PeriodicityWang_th0_01 a 47, mientras SB_TransitionMatrix_3ac_sumdiagcov vive entre 0.005 y 0.046. Sin este paso, las características de rango grande dominarían las distancias y el PCA por escala y no por contenido.</w:t>
+      </w:r>
+    </w:p>
+    <w:p/>
+    <w:p>
+      <w:pPr>
+        <w:pStyle w:val="Heading1"/>
+        <w:numPr>
+          <w:ilvl w:val="0"/>
+          <w:numId w:val="0"/>
+        </w:numPr>
+        <w:ind w:left="10"/>
+        <w:rPr>
+          <w:sz w:val="24"/>
+          <w:szCs w:val="22"/>
+        </w:rPr>
+      </w:pPr>
+      <w:r>
+        <w:rPr>
+          <w:sz w:val="24"/>
+          <w:szCs w:val="22"/>
+        </w:rPr>
+        <w:t>2.5 Análisis</w:t>
+      </w:r>
+    </w:p>
+    <w:p>
+      <w:r>
+        <w:t>Sobre la matriz estandarizada se realizaron los cinco análisis solicitados.</w:t>
+      </w:r>
+    </w:p>
+    <w:p>
+      <w:r>
+        <w:rPr>
+          <w:b/>
+        </w:rPr>
+        <w:t xml:space="preserve">Componentes principales. </w:t>
+      </w:r>
+      <w:r>
+        <w:t>Los primeros dos componentes explican 69.5% de la varianza y los primeros tres, 84.9% (Tabla 3, Figura 1).</w:t>
+      </w:r>
+    </w:p>
+    <w:p/>
+    <w:p>
+      <w:pPr>
+        <w:jc w:val="center"/>
+      </w:pPr>
+      <w:r>
+        <w:rPr>
+          <w:b/>
+        </w:rPr>
+        <w:t xml:space="preserve">Tabla 3. </w:t>
+      </w:r>
+      <w:r>
+        <w:rPr>
+          <w:i/>
+        </w:rPr>
+        <w:t>Varianza explicada por componente principal</w:t>
+      </w:r>
+    </w:p>
+    <w:tbl>
+      <w:tblPr>
+        <w:tblStyle w:val="TableGrid"/>
+        <w:tblW w:w="9634" w:type="dxa"/>
+        <w:tblInd w:w="0" w:type="dxa"/>
+        <w:tblLook w:val="04A0" w:firstRow="1" w:lastRow="0" w:firstColumn="1" w:lastColumn="0" w:noHBand="0" w:noVBand="1"/>
+      </w:tblPr>
+      <w:tblGrid>
+        <w:gridCol w:w="3211"/>
+        <w:gridCol w:w="3211"/>
+        <w:gridCol w:w="3212"/>
+      </w:tblGrid>
+      <w:tr>
+        <w:trPr>
+          <w:tblHeader/>
+        </w:trPr>
+        <w:tc>
+          <w:tcPr>
+            <w:tcW w:w="3211" w:type="dxa"/>
+            <w:shd w:val="clear" w:color="auto" w:fill="D9D9D9"/>
+          </w:tcPr>
+          <w:p>
+            <w:r>
+              <w:rPr>
+                <w:b/>
+              </w:rPr>
+              <w:t>Componente</w:t>
+            </w:r>
+          </w:p>
+        </w:tc>
+        <w:tc>
+          <w:tcPr>
+            <w:tcW w:w="3211" w:type="dxa"/>
+            <w:shd w:val="clear" w:color="auto" w:fill="D9D9D9"/>
+          </w:tcPr>
+          <w:p>
+            <w:r>
+              <w:rPr>
+                <w:b/>
+              </w:rPr>
+              <w:t>Varianza explicada</w:t>
+            </w:r>
+          </w:p>
+        </w:tc>
+        <w:tc>
+          <w:tcPr>
+            <w:tcW w:w="3212" w:type="dxa"/>
+            <w:shd w:val="clear" w:color="auto" w:fill="D9D9D9"/>
+          </w:tcPr>
+          <w:p>
+            <w:r>
+              <w:rPr>
+                <w:b/>
+              </w:rPr>
+              <w:t>Acumulada</w:t>
+            </w:r>
+          </w:p>
+        </w:tc>
+      </w:tr>
+      <w:tr>
+        <w:tc>
+          <w:tcPr>
+            <w:tcW w:w="3211" w:type="dxa"/>
+          </w:tcPr>
+          <w:p>
+            <w:r>
+              <w:t>PC1</w:t>
+            </w:r>
+          </w:p>
+        </w:tc>
+        <w:tc>
+          <w:tcPr>
+            <w:tcW w:w="3211" w:type="dxa"/>
+          </w:tcPr>
+          <w:p>
+            <w:r>
+              <w:t>50.5%</w:t>
+            </w:r>
+          </w:p>
+        </w:tc>
+        <w:tc>
+          <w:tcPr>
+            <w:tcW w:w="3212" w:type="dxa"/>
+          </w:tcPr>
+          <w:p>
+            <w:r>
+              <w:t>50.5%</w:t>
+            </w:r>
+          </w:p>
+        </w:tc>
+      </w:tr>
+      <w:tr>
+        <w:tc>
+          <w:tcPr>
+            <w:tcW w:w="3211" w:type="dxa"/>
+          </w:tcPr>
+          <w:p>
+            <w:r>
+              <w:t>PC2</w:t>
+            </w:r>
+          </w:p>
+        </w:tc>
+        <w:tc>
+          <w:tcPr>
+            <w:tcW w:w="3211" w:type="dxa"/>
+          </w:tcPr>
+          <w:p>
+            <w:r>
+              <w:t>19.1%</w:t>
+            </w:r>
+          </w:p>
+        </w:tc>
+        <w:tc>
+          <w:tcPr>
+            <w:tcW w:w="3212" w:type="dxa"/>
+          </w:tcPr>
+          <w:p>
+            <w:r>
+              <w:t>69.5%</w:t>
+            </w:r>
+          </w:p>
+        </w:tc>
+      </w:tr>
+      <w:tr>
+        <w:tc>
+          <w:tcPr>
+            <w:tcW w:w="3211" w:type="dxa"/>
+          </w:tcPr>
+          <w:p>
+            <w:r>
+              <w:t>PC3</w:t>
+            </w:r>
+          </w:p>
+        </w:tc>
+        <w:tc>
+          <w:tcPr>
+            <w:tcW w:w="3211" w:type="dxa"/>
+          </w:tcPr>
+          <w:p>
+            <w:r>
+              <w:t>15.4%</w:t>
+            </w:r>
+          </w:p>
+        </w:tc>
+        <w:tc>
+          <w:tcPr>
+            <w:tcW w:w="3212" w:type="dxa"/>
+          </w:tcPr>
+          <w:p>
+            <w:r>
+              <w:t>84.9%</w:t>
+            </w:r>
+          </w:p>
+        </w:tc>
+      </w:tr>
+    </w:tbl>
+    <w:p>
+      <w:pPr>
+        <w:jc w:val="center"/>
+      </w:pPr>
+      <w:r>
+        <w:rPr>
+          <w:noProof/>
+        </w:rPr>
+        <w:lastRenderedPageBreak/>
+        <w:drawing>
+          <wp:inline distT="0" distB="0" distL="0" distR="0" wp14:anchorId="5A6B5BF7" wp14:editId="63B409A4">
+            <wp:extent cx="4838261" cy="3931920"/>
+            <wp:effectExtent l="0" t="0" r="0" b="0"/>
+            <wp:docPr id="101" name="Picture 101"/>
+            <wp:cNvGraphicFramePr/>
+            <a:graphic xmlns:a="http://schemas.openxmlformats.org/drawingml/2006/main">
+              <a:graphicData uri="http://schemas.openxmlformats.org/drawingml/2006/picture">
+                <pic:pic xmlns:pic="http://schemas.openxmlformats.org/drawingml/2006/picture">
+                  <pic:nvPicPr>
+                    <pic:cNvPr id="101" name="Picture 101"/>
+                    <pic:cNvPicPr/>
+                  </pic:nvPicPr>
+                  <pic:blipFill>
+                    <a:blip r:embed="rId6"/>
+                    <a:stretch>
+                      <a:fillRect/>
+                    </a:stretch>
+                  </pic:blipFill>
+                  <pic:spPr>
+                    <a:xfrm>
+                      <a:off x="0" y="0"/>
+                      <a:ext cx="4838261" cy="3931920"/>
+                    </a:xfrm>
+                    <a:prstGeom prst="rect">
+                      <a:avLst/>
+                    </a:prstGeom>
+                  </pic:spPr>
+                </pic:pic>
+              </a:graphicData>
+            </a:graphic>
+          </wp:inline>
+        </w:drawing>
+      </w:r>
+    </w:p>
+    <w:p>
+      <w:pPr>
+        <w:jc w:val="center"/>
+        <w:rPr>
+          <w:i/>
+        </w:rPr>
+      </w:pPr>
+      <w:r>
+        <w:rPr>
+          <w:b/>
+        </w:rPr>
+        <w:t xml:space="preserve">Figura 1. </w:t>
+      </w:r>
+      <w:r>
+        <w:rPr>
+          <w:i/>
+        </w:rPr>
+        <w:t>Dispersión de las series en PC1 y PC2</w:t>
+      </w:r>
+    </w:p>
+    <w:p>
+      <w:pPr>
+        <w:jc w:val="center"/>
+      </w:pPr>
+    </w:p>
+    <w:p>
+      <w:r>
+        <w:rPr>
+          <w:b/>
+        </w:rPr>
+        <w:t xml:space="preserve">Clustering. </w:t>
+      </w:r>
+      <w:r>
+        <w:t>El clustering jerárquico con enlace de Ward y el coeficiente de silueta favorecen k = 2 (Tabla 4), que aísla a Pais_Guatemala del resto de las series (Figura 2).</w:t>
+      </w:r>
+    </w:p>
+    <w:p/>
+    <w:p>
+      <w:pPr>
+        <w:jc w:val="center"/>
+      </w:pPr>
+      <w:r>
+        <w:rPr>
+          <w:b/>
+        </w:rPr>
+        <w:t xml:space="preserve">Tabla 4. </w:t>
+      </w:r>
+      <w:r>
+        <w:rPr>
+          <w:i/>
+        </w:rPr>
+        <w:t>Coeficiente de silueta por número de grupos</w:t>
+      </w:r>
+    </w:p>
+    <w:tbl>
+      <w:tblPr>
+        <w:tblStyle w:val="TableGrid"/>
+        <w:tblW w:w="9634" w:type="dxa"/>
+        <w:tblInd w:w="0" w:type="dxa"/>
+        <w:tblLook w:val="04A0" w:firstRow="1" w:lastRow="0" w:firstColumn="1" w:lastColumn="0" w:noHBand="0" w:noVBand="1"/>
+      </w:tblPr>
+      <w:tblGrid>
+        <w:gridCol w:w="4817"/>
+        <w:gridCol w:w="4817"/>
+      </w:tblGrid>
+      <w:tr>
+        <w:trPr>
+          <w:tblHeader/>
+        </w:trPr>
+        <w:tc>
+          <w:tcPr>
+            <w:tcW w:w="4817" w:type="dxa"/>
+            <w:shd w:val="clear" w:color="auto" w:fill="D9D9D9"/>
+          </w:tcPr>
+          <w:p>
+            <w:r>
+              <w:rPr>
+                <w:b/>
+              </w:rPr>
+              <w:t>k</w:t>
+            </w:r>
+          </w:p>
+        </w:tc>
+        <w:tc>
+          <w:tcPr>
+            <w:tcW w:w="4817" w:type="dxa"/>
+            <w:shd w:val="clear" w:color="auto" w:fill="D9D9D9"/>
+          </w:tcPr>
+          <w:p>
+            <w:r>
+              <w:rPr>
+                <w:b/>
+              </w:rPr>
+              <w:t>Silueta</w:t>
+            </w:r>
+          </w:p>
+        </w:tc>
+      </w:tr>
+      <w:tr>
+        <w:tc>
+          <w:tcPr>
+            <w:tcW w:w="4817" w:type="dxa"/>
+          </w:tcPr>
+          <w:p>
+            <w:r>
+              <w:t>2</w:t>
+            </w:r>
+          </w:p>
+        </w:tc>
+        <w:tc>
+          <w:tcPr>
+            <w:tcW w:w="4817" w:type="dxa"/>
+          </w:tcPr>
+          <w:p>
+            <w:r>
+              <w:t>0.2714</w:t>
+            </w:r>
+          </w:p>
+        </w:tc>
+      </w:tr>
+      <w:tr>
+        <w:tc>
+          <w:tcPr>
+            <w:tcW w:w="4817" w:type="dxa"/>
+          </w:tcPr>
+          <w:p>
+            <w:r>
+              <w:t>3</w:t>
+            </w:r>
+          </w:p>
+        </w:tc>
+        <w:tc>
+          <w:tcPr>
+            <w:tcW w:w="4817" w:type="dxa"/>
+          </w:tcPr>
+          <w:p>
+            <w:r>
+              <w:t>0.1648</w:t>
+            </w:r>
+          </w:p>
+        </w:tc>
+      </w:tr>
+      <w:tr>
+        <w:tc>
+          <w:tcPr>
+            <w:tcW w:w="4817" w:type="dxa"/>
+          </w:tcPr>
+          <w:p>
+            <w:r>
+              <w:t>4</w:t>
+            </w:r>
+          </w:p>
+        </w:tc>
+        <w:tc>
+          <w:tcPr>
+            <w:tcW w:w="4817" w:type="dxa"/>
+          </w:tcPr>
+          <w:p>
+            <w:r>
+              <w:t>0.1065</w:t>
+            </w:r>
+          </w:p>
+        </w:tc>
+      </w:tr>
+    </w:tbl>
+    <w:p>
+      <w:pPr>
+        <w:jc w:val="center"/>
+      </w:pPr>
+      <w:r>
+        <w:rPr>
+          <w:noProof/>
+        </w:rPr>
+        <w:lastRenderedPageBreak/>
+        <w:drawing>
+          <wp:inline distT="0" distB="0" distL="0" distR="0" wp14:anchorId="0CE2BC89" wp14:editId="71679315">
+            <wp:extent cx="5760720" cy="3856509"/>
+            <wp:effectExtent l="0" t="0" r="0" b="0"/>
+            <wp:docPr id="102" name="Picture 102"/>
+            <wp:cNvGraphicFramePr/>
+            <a:graphic xmlns:a="http://schemas.openxmlformats.org/drawingml/2006/main">
+              <a:graphicData uri="http://schemas.openxmlformats.org/drawingml/2006/picture">
+                <pic:pic xmlns:pic="http://schemas.openxmlformats.org/drawingml/2006/picture">
+                  <pic:nvPicPr>
+                    <pic:cNvPr id="102" name="Picture 102"/>
+                    <pic:cNvPicPr/>
+                  </pic:nvPicPr>
+                  <pic:blipFill>
+                    <a:blip r:embed="rId7"/>
+                    <a:stretch>
+                      <a:fillRect/>
+                    </a:stretch>
+                  </pic:blipFill>
+                  <pic:spPr>
+                    <a:xfrm>
+                      <a:off x="0" y="0"/>
+                      <a:ext cx="5760720" cy="3856509"/>
+                    </a:xfrm>
+                    <a:prstGeom prst="rect">
+                      <a:avLst/>
+                    </a:prstGeom>
+                  </pic:spPr>
+                </pic:pic>
+              </a:graphicData>
+            </a:graphic>
+          </wp:inline>
+        </w:drawing>
+      </w:r>
+    </w:p>
+    <w:p>
+      <w:pPr>
+        <w:jc w:val="center"/>
+        <w:rPr>
+          <w:i/>
+        </w:rPr>
+      </w:pPr>
+      <w:r>
+        <w:rPr>
+          <w:b/>
+        </w:rPr>
+        <w:t xml:space="preserve">Figura 2. </w:t>
+      </w:r>
+      <w:r>
+        <w:rPr>
+          <w:i/>
+        </w:rPr>
+        <w:t>Dendrograma de clustering jerárquico (enlace de Ward)</w:t>
+      </w:r>
+    </w:p>
+    <w:p>
+      <w:pPr>
+        <w:jc w:val="center"/>
+      </w:pPr>
+    </w:p>
+    <w:p>
+      <w:r>
+        <w:rPr>
+          <w:b/>
+        </w:rPr>
+        <w:t xml:space="preserve">Mapa de calor. </w:t>
+      </w:r>
+      <w:r>
+        <w:t>Muestra las 22 características estandarizadas por serie, con escala divergente centrada en cero (Figura 3).</w:t>
+      </w:r>
+    </w:p>
+    <w:p/>
+    <w:p>
+      <w:pPr>
+        <w:jc w:val="center"/>
+      </w:pPr>
+      <w:r>
+        <w:rPr>
+          <w:noProof/>
+        </w:rPr>
+        <w:drawing>
+          <wp:inline distT="0" distB="0" distL="0" distR="0" wp14:anchorId="2D827920" wp14:editId="016D9B11">
+            <wp:extent cx="5760720" cy="2756007"/>
+            <wp:effectExtent l="0" t="0" r="0" b="0"/>
+            <wp:docPr id="103" name="Picture 103"/>
+            <wp:cNvGraphicFramePr/>
+            <a:graphic xmlns:a="http://schemas.openxmlformats.org/drawingml/2006/main">
+              <a:graphicData uri="http://schemas.openxmlformats.org/drawingml/2006/picture">
+                <pic:pic xmlns:pic="http://schemas.openxmlformats.org/drawingml/2006/picture">
+                  <pic:nvPicPr>
+                    <pic:cNvPr id="103" name="Picture 103"/>
+                    <pic:cNvPicPr/>
+                  </pic:nvPicPr>
+                  <pic:blipFill>
+                    <a:blip r:embed="rId8"/>
+                    <a:stretch>
+                      <a:fillRect/>
+                    </a:stretch>
+                  </pic:blipFill>
+                  <pic:spPr>
+                    <a:xfrm>
+                      <a:off x="0" y="0"/>
+                      <a:ext cx="5760720" cy="2756007"/>
+                    </a:xfrm>
+                    <a:prstGeom prst="rect">
+                      <a:avLst/>
+                    </a:prstGeom>
+                  </pic:spPr>
+                </pic:pic>
+              </a:graphicData>
+            </a:graphic>
+          </wp:inline>
+        </w:drawing>
+      </w:r>
+    </w:p>
+    <w:p>
+      <w:pPr>
+        <w:jc w:val="center"/>
+      </w:pPr>
+      <w:r>
+        <w:rPr>
+          <w:b/>
+        </w:rPr>
+        <w:t xml:space="preserve">Figura 3. </w:t>
+      </w:r>
+      <w:r>
+        <w:rPr>
+          <w:i/>
+        </w:rPr>
+        <w:t>Mapa de calor de las 22 características estandarizadas</w:t>
+      </w:r>
+    </w:p>
+    <w:p>
+      <w:r>
+        <w:rPr>
+          <w:b/>
+        </w:rPr>
+        <w:lastRenderedPageBreak/>
+        <w:t xml:space="preserve">Correlaciones entre características. </w:t>
+      </w:r>
+      <w:r>
+        <w:t>13 de los 231 pares superan |r| = 0.9, con una media de 0.470 (Figura 4). Al estimarse con solo 7 series, estos valores son inestables y no implican redundancia general en catch22.</w:t>
+      </w:r>
+    </w:p>
+    <w:p/>
+    <w:p>
+      <w:pPr>
+        <w:jc w:val="center"/>
+      </w:pPr>
+      <w:r>
+        <w:rPr>
+          <w:noProof/>
+        </w:rPr>
+        <w:drawing>
+          <wp:inline distT="0" distB="0" distL="0" distR="0" wp14:anchorId="64E297DE" wp14:editId="63E8FE6F">
+            <wp:extent cx="4271554" cy="3931920"/>
+            <wp:effectExtent l="0" t="0" r="0" b="0"/>
+            <wp:docPr id="104" name="Picture 104"/>
+            <wp:cNvGraphicFramePr/>
+            <a:graphic xmlns:a="http://schemas.openxmlformats.org/drawingml/2006/main">
+              <a:graphicData uri="http://schemas.openxmlformats.org/drawingml/2006/picture">
+                <pic:pic xmlns:pic="http://schemas.openxmlformats.org/drawingml/2006/picture">
+                  <pic:nvPicPr>
+                    <pic:cNvPr id="104" name="Picture 104"/>
+                    <pic:cNvPicPr/>
+                  </pic:nvPicPr>
+                  <pic:blipFill>
+                    <a:blip r:embed="rId9"/>
+                    <a:stretch>
+                      <a:fillRect/>
+                    </a:stretch>
+                  </pic:blipFill>
+                  <pic:spPr>
+                    <a:xfrm>
+                      <a:off x="0" y="0"/>
+                      <a:ext cx="4271554" cy="3931920"/>
+                    </a:xfrm>
+                    <a:prstGeom prst="rect">
+                      <a:avLst/>
+                    </a:prstGeom>
+                  </pic:spPr>
+                </pic:pic>
+              </a:graphicData>
+            </a:graphic>
+          </wp:inline>
+        </w:drawing>
+      </w:r>
+    </w:p>
+    <w:p>
+      <w:pPr>
+        <w:jc w:val="center"/>
+        <w:rPr>
+          <w:i/>
+        </w:rPr>
+      </w:pPr>
+      <w:r>
+        <w:rPr>
+          <w:b/>
+        </w:rPr>
+        <w:t xml:space="preserve">Figura 4. </w:t>
+      </w:r>
+      <w:r>
+        <w:rPr>
+          <w:i/>
+        </w:rPr>
+        <w:t>Matriz de correlaciones entre características</w:t>
+      </w:r>
+    </w:p>
+    <w:p>
+      <w:pPr>
+        <w:jc w:val="center"/>
+      </w:pPr>
+    </w:p>
+    <w:p>
+      <w:r>
+        <w:rPr>
+          <w:b/>
+        </w:rPr>
+        <w:t xml:space="preserve">Distancias entre series. </w:t>
+      </w:r>
+      <w:r>
+        <w:t>El par más cercano es Total_Consistent con Via_Terrestre (4.17) y el más lejano, Pais_Guatemala con Via_Maritima (11.52). Pais_Guatemala y Via_Maritima tienen además la mayor distancia promedio al resto, las mismas series que el dendrograma separa primero (Figura 5).</w:t>
+      </w:r>
+    </w:p>
+    <w:p>
+      <w:pPr>
+        <w:jc w:val="center"/>
+      </w:pPr>
+      <w:r>
+        <w:rPr>
+          <w:noProof/>
+        </w:rPr>
+        <w:lastRenderedPageBreak/>
+        <w:drawing>
+          <wp:inline distT="0" distB="0" distL="0" distR="0" wp14:anchorId="7C75C502" wp14:editId="4D13D204">
+            <wp:extent cx="4348879" cy="3931920"/>
+            <wp:effectExtent l="0" t="0" r="0" b="0"/>
+            <wp:docPr id="105" name="Picture 105"/>
+            <wp:cNvGraphicFramePr/>
+            <a:graphic xmlns:a="http://schemas.openxmlformats.org/drawingml/2006/main">
+              <a:graphicData uri="http://schemas.openxmlformats.org/drawingml/2006/picture">
+                <pic:pic xmlns:pic="http://schemas.openxmlformats.org/drawingml/2006/picture">
+                  <pic:nvPicPr>
+                    <pic:cNvPr id="105" name="Picture 105"/>
+                    <pic:cNvPicPr/>
+                  </pic:nvPicPr>
+                  <pic:blipFill>
+                    <a:blip r:embed="rId10"/>
+                    <a:stretch>
+                      <a:fillRect/>
+                    </a:stretch>
+                  </pic:blipFill>
+                  <pic:spPr>
+                    <a:xfrm>
+                      <a:off x="0" y="0"/>
+                      <a:ext cx="4348879" cy="3931920"/>
+                    </a:xfrm>
+                    <a:prstGeom prst="rect">
+                      <a:avLst/>
+                    </a:prstGeom>
+                  </pic:spPr>
+                </pic:pic>
+              </a:graphicData>
+            </a:graphic>
+          </wp:inline>
+        </w:drawing>
+      </w:r>
+    </w:p>
+    <w:p>
+      <w:pPr>
+        <w:jc w:val="center"/>
+        <w:rPr>
+          <w:i/>
+        </w:rPr>
+      </w:pPr>
+      <w:r>
+        <w:rPr>
+          <w:b/>
+        </w:rPr>
+        <w:t xml:space="preserve">Figura 5. </w:t>
+      </w:r>
+      <w:r>
+        <w:rPr>
+          <w:i/>
+        </w:rPr>
+        <w:t>Mapa de distancias euclidianas entre series</w:t>
+      </w:r>
+    </w:p>
+    <w:p>
+      <w:pPr>
+        <w:jc w:val="center"/>
+      </w:pPr>
+    </w:p>
+    <w:p>
+      <w:r>
+        <w:rPr>
+          <w:b/>
+        </w:rPr>
+        <w:t xml:space="preserve">Nota: </w:t>
+      </w:r>
+      <w:r>
+        <w:t>con 7 series en un espacio de 22 dimensiones, el PCA solo estima 6 componentes con varianza no nula y las correlaciones entre características tienen alta incertidumbre. Estos resultados sirven para comparar las siete series entre sí, no para conclusiones generales sobre catch22.</w:t>
+      </w:r>
+    </w:p>
+    <w:p/>
+    <w:p>
+      <w:pPr>
         <w:pStyle w:val="Heading1"/>
       </w:pPr>
       <w:r>
@@ -1156,37 +2081,35 @@
         <w:rPr>
           <w:lang w:val="en-US"/>
         </w:rPr>
-        <w:t>Fulcher, B. D., Little, M. A., &amp; Jones, N. S. (2013). Highly comparative time-series analysis: The empirical structure of time series and their methods. Journal of the Royal Society Interface, 10(83), Article 20130048. https://doi.org/10.1098/rsif.2013.0048</w:t>
-      </w:r>
-    </w:p>
-    <w:p>
-      <w:pPr>
-        <w:spacing w:after="200"/>
-        <w:ind w:left="720" w:hanging="720"/>
+        <w:t>Fulcher, B. D. (</w:t>
+      </w:r>
+      <w:proofErr w:type="spellStart"/>
+      <w:r>
         <w:rPr>
           <w:lang w:val="en-US"/>
         </w:rPr>
-      </w:pPr>
+        <w:t>s.f.</w:t>
+      </w:r>
+      <w:proofErr w:type="spellEnd"/>
       <w:r>
         <w:rPr>
           <w:lang w:val="en-US"/>
         </w:rPr>
-        <w:t>Lubba, C. H., Sethi, S. S., Knaute, P., Schultz, S. R., Fulcher, B. D., &amp; Jones, N. S. (2019). catch22: CAnonical Time-series CHaracteristics. Data Mining and Knowledge Discovery, 33(6), 1821-1852. https://doi.org/10.1007/s10618-019-00647-x</w:t>
-      </w:r>
-    </w:p>
-    <w:p>
-      <w:pPr>
-        <w:spacing w:after="200"/>
-        <w:ind w:left="720" w:hanging="720"/>
+        <w:t xml:space="preserve">). Introduction. </w:t>
+      </w:r>
+      <w:proofErr w:type="spellStart"/>
+      <w:r>
         <w:rPr>
           <w:lang w:val="en-US"/>
         </w:rPr>
-      </w:pPr>
+        <w:t>hctsa</w:t>
+      </w:r>
+      <w:proofErr w:type="spellEnd"/>
       <w:r>
         <w:rPr>
           <w:lang w:val="en-US"/>
         </w:rPr>
-        <w:t>Middlehurst, M., Ismail-Fawaz, A., Guillaume, A., Holder, C., Guijo-Rubio, D., Bulatova, G., Tsaprounis, L., Mentel, L., Walter, M., Schäfer, P., &amp; Bagnall, A. (2024). aeon: A Python toolkit for learning from time series. Journal of Machine Learning Research, 25(289), 1-10. https://www.jmlr.org/papers/v25/23-1444.html</w:t>
+        <w:t xml:space="preserve"> manual. https://time-series-features.gitbook.io/hctsa-manual</w:t>
       </w:r>
     </w:p>
     <w:sectPr>

</xml_diff>